<commit_message>
Add charts to the workbook and an Investment Considerations section to the report
- Textile_Peer_Comparison.xlsx: adds four comparison charts on the Peer
  Comparison sheet (P/E, OPM vs NPM, ROE vs ROCE, revenue vs net profit),
  built from the same cell ranges as the table so they stay in sync with the
  data.
- Textile_Industry_Equity_Research_Report.docx/.pdf: adds an Investment
  Considerations section that synthesizes the peer comparison data
  (valuation spread, profitability/returns, growth, leverage) — computed
  from the underlying figures rather than hardcoded, and framed as
  descriptive positioning within the peer set, not a recommendation.
- Table of contents page numbers re-verified against the actual rendered
  PDF after the new section shifted pagination.

Co-Authored-By: Claude Sonnet 5 <noreply@anthropic.com>
Claude-Session: https://claude.ai/code/session_014c24deaoFxEeriwm2WaAVx
</commit_message>
<xml_diff>
--- a/projects/textile-equity-research/reports/Textile_Industry_Equity_Research_Report.docx
+++ b/projects/textile-equity-research/reports/Textile_Industry_Equity_Research_Report.docx
@@ -232,7 +232,7 @@
           <w:sz w:val="21"/>
           <w:szCs w:val="21"/>
         </w:rPr>
-        <w:t xml:space="preserve">Company Snapshots</w:t>
+        <w:t xml:space="preserve">Investment Considerations</w:t>
       </w:r>
       <w:r>
         <w:ptab w:alignment="right" w:relativeTo="margin" w:leader="dot"/>
@@ -244,6 +244,33 @@
           <w:szCs w:val="21"/>
         </w:rPr>
         <w:t xml:space="preserve">9</w:t>
+      </w:r>
+    </w:p>
+    <w:p>
+      <w:pPr>
+        <w:spacing w:after="100"/>
+      </w:pPr>
+      <w:r>
+        <w:rPr>
+          <w:rFonts w:ascii="Calibri" w:cs="Calibri" w:eastAsia="Calibri" w:hAnsi="Calibri"/>
+          <w:b/>
+          <w:bCs/>
+          <w:color w:val="1F3864"/>
+          <w:sz w:val="21"/>
+          <w:szCs w:val="21"/>
+        </w:rPr>
+        <w:t xml:space="preserve">Company Snapshots</w:t>
+      </w:r>
+      <w:r>
+        <w:ptab w:alignment="right" w:relativeTo="margin" w:leader="dot"/>
+      </w:r>
+      <w:r>
+        <w:rPr>
+          <w:rFonts w:ascii="Calibri" w:cs="Calibri" w:eastAsia="Calibri" w:hAnsi="Calibri"/>
+          <w:sz w:val="21"/>
+          <w:szCs w:val="21"/>
+        </w:rPr>
+        <w:t xml:space="preserve">11</w:t>
       </w:r>
     </w:p>
     <w:p>
@@ -271,7 +298,7 @@
           <w:sz w:val="19"/>
           <w:szCs w:val="19"/>
         </w:rPr>
-        <w:t xml:space="preserve">9</w:t>
+        <w:t xml:space="preserve">11</w:t>
       </w:r>
     </w:p>
     <w:p>
@@ -299,7 +326,7 @@
           <w:sz w:val="19"/>
           <w:szCs w:val="19"/>
         </w:rPr>
-        <w:t xml:space="preserve">11</w:t>
+        <w:t xml:space="preserve">13</w:t>
       </w:r>
     </w:p>
     <w:p>
@@ -327,7 +354,7 @@
           <w:sz w:val="19"/>
           <w:szCs w:val="19"/>
         </w:rPr>
-        <w:t xml:space="preserve">13</w:t>
+        <w:t xml:space="preserve">15</w:t>
       </w:r>
     </w:p>
     <w:p>
@@ -355,7 +382,7 @@
           <w:sz w:val="19"/>
           <w:szCs w:val="19"/>
         </w:rPr>
-        <w:t xml:space="preserve">15</w:t>
+        <w:t xml:space="preserve">17</w:t>
       </w:r>
     </w:p>
     <w:p>
@@ -383,7 +410,7 @@
           <w:sz w:val="19"/>
           <w:szCs w:val="19"/>
         </w:rPr>
-        <w:t xml:space="preserve">17</w:t>
+        <w:t xml:space="preserve">19</w:t>
       </w:r>
     </w:p>
     <w:p>
@@ -411,7 +438,7 @@
           <w:sz w:val="19"/>
           <w:szCs w:val="19"/>
         </w:rPr>
-        <w:t xml:space="preserve">19</w:t>
+        <w:t xml:space="preserve">21</w:t>
       </w:r>
     </w:p>
     <w:p>
@@ -439,7 +466,7 @@
           <w:sz w:val="19"/>
           <w:szCs w:val="19"/>
         </w:rPr>
-        <w:t xml:space="preserve">21</w:t>
+        <w:t xml:space="preserve">23</w:t>
       </w:r>
     </w:p>
     <w:p>
@@ -467,7 +494,7 @@
           <w:sz w:val="19"/>
           <w:szCs w:val="19"/>
         </w:rPr>
-        <w:t xml:space="preserve">23</w:t>
+        <w:t xml:space="preserve">25</w:t>
       </w:r>
     </w:p>
     <w:p>
@@ -494,7 +521,7 @@
           <w:sz w:val="21"/>
           <w:szCs w:val="21"/>
         </w:rPr>
-        <w:t xml:space="preserve">25</w:t>
+        <w:t xml:space="preserve">27</w:t>
       </w:r>
     </w:p>
     <w:p>
@@ -4658,6 +4685,248 @@
           <w:docGrid w:linePitch="360"/>
         </w:sectPr>
       </w:pPr>
+    </w:p>
+    <w:p>
+      <w:pPr>
+        <w:pStyle w:val="Heading1"/>
+        <w:pBdr>
+          <w:bottom w:val="single" w:color="1F3864" w:sz="6" w:space="4"/>
+        </w:pBdr>
+        <w:spacing w:after="200" w:before="400"/>
+      </w:pPr>
+      <w:r>
+        <w:rPr>
+          <w:rFonts w:ascii="Georgia" w:cs="Georgia" w:eastAsia="Georgia" w:hAnsi="Georgia"/>
+          <w:b/>
+          <w:bCs/>
+          <w:color w:val="1F3864"/>
+          <w:sz w:val="30"/>
+          <w:szCs w:val="30"/>
+        </w:rPr>
+        <w:t xml:space="preserve">Investment Considerations</w:t>
+      </w:r>
+    </w:p>
+    <w:p>
+      <w:pPr>
+        <w:spacing w:after="160" w:line="300"/>
+      </w:pPr>
+      <w:r>
+        <w:rPr>
+          <w:rFonts w:ascii="Calibri" w:cs="Calibri" w:eastAsia="Calibri" w:hAnsi="Calibri"/>
+          <w:sz w:val="21"/>
+          <w:szCs w:val="21"/>
+        </w:rPr>
+        <w:t xml:space="preserve">The observations below are purely comparative — how the eight companies in this peer set stack up against each other on the metrics gathered. They are descriptive positioning within the sample, not a ranking, rating, or recommendation; see the Disclaimer &amp; Methodology section before drawing any conclusion from them.</w:t>
+      </w:r>
+    </w:p>
+    <w:p>
+      <w:pPr>
+        <w:pStyle w:val="Heading2"/>
+        <w:spacing w:after="140" w:before="300"/>
+      </w:pPr>
+      <w:r>
+        <w:rPr>
+          <w:rFonts w:ascii="Georgia" w:cs="Georgia" w:eastAsia="Georgia" w:hAnsi="Georgia"/>
+          <w:b/>
+          <w:bCs/>
+          <w:color w:val="2E5395"/>
+          <w:sz w:val="25"/>
+          <w:szCs w:val="25"/>
+        </w:rPr>
+        <w:t xml:space="preserve">Valuation Spread</w:t>
+      </w:r>
+    </w:p>
+    <w:p>
+      <w:pPr>
+        <w:spacing w:after="160" w:line="300"/>
+      </w:pPr>
+      <w:r>
+        <w:rPr>
+          <w:rFonts w:ascii="Calibri" w:cs="Calibri" w:eastAsia="Calibri" w:hAnsi="Calibri"/>
+          <w:sz w:val="21"/>
+          <w:szCs w:val="21"/>
+        </w:rPr>
+        <w:t xml:space="preserve">Trailing P/E across the peer set spans roughly 21.0x (Vardhman Textiles Ltd) to 102.1x (Raymond Lifestyle Ltd) — a wide range that reflects the mix in this sample: commodity-linked spinners and integrated manufacturers tend to sit at the lower end, while branded consumer names and businesses coming off a low or transitional profit base tend to sit at the higher end. A low P/E on its own does not mean "cheap" — it can also reflect lower growth, thinner margins, or higher perceived risk; the same caveat applies in reverse for a high P/E.</w:t>
+      </w:r>
+    </w:p>
+    <w:p>
+      <w:pPr>
+        <w:pStyle w:val="Heading2"/>
+        <w:spacing w:after="140" w:before="300"/>
+      </w:pPr>
+      <w:r>
+        <w:rPr>
+          <w:rFonts w:ascii="Georgia" w:cs="Georgia" w:eastAsia="Georgia" w:hAnsi="Georgia"/>
+          <w:b/>
+          <w:bCs/>
+          <w:color w:val="2E5395"/>
+          <w:sz w:val="25"/>
+          <w:szCs w:val="25"/>
+        </w:rPr>
+        <w:t xml:space="preserve">Profitability &amp; Returns</w:t>
+      </w:r>
+    </w:p>
+    <w:p>
+      <w:pPr>
+        <w:spacing w:after="160" w:line="300"/>
+      </w:pPr>
+      <w:r>
+        <w:rPr>
+          <w:rFonts w:ascii="Calibri" w:cs="Calibri" w:eastAsia="Calibri" w:hAnsi="Calibri"/>
+          <w:sz w:val="21"/>
+          <w:szCs w:val="21"/>
+        </w:rPr>
+        <w:t xml:space="preserve">Page Industries Limited posts the highest return on both equity (47.6%) and capital employed (68.2%) in the set. Businesses with an asset-light, brand-licensing or export-manufacturing model generally screen higher on both measures than integrated spinning/weaving operations, which carry heavier fixed-asset bases.</w:t>
+      </w:r>
+    </w:p>
+    <w:p>
+      <w:pPr>
+        <w:pStyle w:val="Heading2"/>
+        <w:spacing w:after="140" w:before="300"/>
+      </w:pPr>
+      <w:r>
+        <w:rPr>
+          <w:rFonts w:ascii="Georgia" w:cs="Georgia" w:eastAsia="Georgia" w:hAnsi="Georgia"/>
+          <w:b/>
+          <w:bCs/>
+          <w:color w:val="2E5395"/>
+          <w:sz w:val="25"/>
+          <w:szCs w:val="25"/>
+        </w:rPr>
+        <w:t xml:space="preserve">Growth</w:t>
+      </w:r>
+    </w:p>
+    <w:p>
+      <w:pPr>
+        <w:spacing w:after="160" w:line="300"/>
+      </w:pPr>
+      <w:r>
+        <w:rPr>
+          <w:rFonts w:ascii="Calibri" w:cs="Calibri" w:eastAsia="Calibri" w:hAnsi="Calibri"/>
+          <w:sz w:val="21"/>
+          <w:szCs w:val="21"/>
+        </w:rPr>
+        <w:t xml:space="preserve">On trailing 3-year CAGR, Gokaldas Exports Ltd shows both the strongest revenue growth (20.9%) and the strongest profit growth (60.2%) in the sample. Growth figures for a couple of companies in this set are flagged "n/a" where a reliable 3-year figure could not be sourced — see their Company Notes entry rather than reading the absence as zero growth.</w:t>
+      </w:r>
+    </w:p>
+    <w:p>
+      <w:pPr>
+        <w:pStyle w:val="Heading2"/>
+        <w:spacing w:after="140" w:before="300"/>
+      </w:pPr>
+      <w:r>
+        <w:rPr>
+          <w:rFonts w:ascii="Georgia" w:cs="Georgia" w:eastAsia="Georgia" w:hAnsi="Georgia"/>
+          <w:b/>
+          <w:bCs/>
+          <w:color w:val="2E5395"/>
+          <w:sz w:val="25"/>
+          <w:szCs w:val="25"/>
+        </w:rPr>
+        <w:t xml:space="preserve">Leverage &amp; Balance Sheet</w:t>
+      </w:r>
+    </w:p>
+    <w:p>
+      <w:pPr>
+        <w:spacing w:after="160" w:line="300"/>
+      </w:pPr>
+      <w:r>
+        <w:rPr>
+          <w:rFonts w:ascii="Calibri" w:cs="Calibri" w:eastAsia="Calibri" w:hAnsi="Calibri"/>
+          <w:sz w:val="21"/>
+          <w:szCs w:val="21"/>
+        </w:rPr>
+        <w:t xml:space="preserve">Debt-to-equity ranges from 0.02x (Page Industries Limited) to 0.68x (Welspun Living Ltd). None of the eight carry what would typically be considered heavy leverage, but the names with acquisition-funded expansion or capex-heavy capacity build-outs (see each company's Recent Developments) carry meaningfully more balance-sheet risk than the more conservatively financed names in the set.</w:t>
+      </w:r>
+    </w:p>
+    <w:p>
+      <w:pPr>
+        <w:spacing w:after="160" w:line="300"/>
+      </w:pPr>
+      <w:r>
+        <w:rPr>
+          <w:rFonts w:ascii="Calibri" w:cs="Calibri" w:eastAsia="Calibri" w:hAnsi="Calibri"/>
+          <w:sz w:val="21"/>
+          <w:szCs w:val="21"/>
+        </w:rPr>
+        <w:t xml:space="preserve">Trident Limited carries the highest trailing dividend yield in the set at 2.0%; yields across the rest of the peer group are modest, consistent with a sector where most listed players are still prioritizing capacity expansion and working-capital needs over payout.</w:t>
+      </w:r>
+    </w:p>
+    <w:p>
+      <w:pPr>
+        <w:pStyle w:val="Heading2"/>
+        <w:spacing w:after="140" w:before="300"/>
+      </w:pPr>
+      <w:r>
+        <w:rPr>
+          <w:rFonts w:ascii="Georgia" w:cs="Georgia" w:eastAsia="Georgia" w:hAnsi="Georgia"/>
+          <w:b/>
+          <w:bCs/>
+          <w:color w:val="2E5395"/>
+          <w:sz w:val="25"/>
+          <w:szCs w:val="25"/>
+        </w:rPr>
+        <w:t xml:space="preserve">How to use this section</w:t>
+      </w:r>
+    </w:p>
+    <w:p>
+      <w:pPr>
+        <w:pStyle w:val="ListParagraph"/>
+        <w:numPr>
+          <w:ilvl w:val="0"/>
+          <w:numId w:val="2"/>
+        </w:numPr>
+        <w:spacing w:after="90" w:line="280"/>
+      </w:pPr>
+      <w:r>
+        <w:rPr>
+          <w:rFonts w:ascii="Calibri" w:cs="Calibri" w:eastAsia="Calibri" w:hAnsi="Calibri"/>
+          <w:sz w:val="21"/>
+          <w:szCs w:val="21"/>
+        </w:rPr>
+        <w:t xml:space="preserve">Cross-reference any single metric against the company's own Business and Recent Developments notes — a metric in isolation (e.g. a low P/E, or a high ROE) can be misleading without that context.</w:t>
+      </w:r>
+    </w:p>
+    <w:p>
+      <w:pPr>
+        <w:pStyle w:val="ListParagraph"/>
+        <w:numPr>
+          <w:ilvl w:val="0"/>
+          <w:numId w:val="2"/>
+        </w:numPr>
+        <w:spacing w:after="90" w:line="280"/>
+      </w:pPr>
+      <w:r>
+        <w:rPr>
+          <w:rFonts w:ascii="Calibri" w:cs="Calibri" w:eastAsia="Calibri" w:hAnsi="Calibri"/>
+          <w:sz w:val="21"/>
+          <w:szCs w:val="21"/>
+        </w:rPr>
+        <w:t xml:space="preserve">Treat 3-year CAGR and margin figures as backward-looking; the Industry Overview section covers forward-looking demand, tariff and policy drivers that could change the picture for export-facing names in particular.</w:t>
+      </w:r>
+    </w:p>
+    <w:p>
+      <w:pPr>
+        <w:pStyle w:val="ListParagraph"/>
+        <w:numPr>
+          <w:ilvl w:val="0"/>
+          <w:numId w:val="2"/>
+        </w:numPr>
+        <w:spacing w:after="90" w:line="280"/>
+      </w:pPr>
+      <w:r>
+        <w:rPr>
+          <w:rFonts w:ascii="Calibri" w:cs="Calibri" w:eastAsia="Calibri" w:hAnsi="Calibri"/>
+          <w:sz w:val="21"/>
+          <w:szCs w:val="21"/>
+        </w:rPr>
+        <w:t xml:space="preserve">Verify any figure you intend to rely on against the company's own filings or a live market data source before using it — see the Disclaimer &amp; Methodology section for why.</w:t>
+      </w:r>
+    </w:p>
+    <w:p>
+      <w:r>
+        <w:br w:type="page"/>
+      </w:r>
     </w:p>
     <w:p>
       <w:pPr>

</xml_diff>